<commit_message>
footer and Resume Update
</commit_message>
<xml_diff>
--- a/B_Muthu_resume.docx
+++ b/B_Muthu_resume.docx
@@ -248,8 +248,17 @@
                                   <w:color w:val="474747"/>
                                   <w:sz w:val="18"/>
                                 </w:rPr>
-                                <w:t>Mayiladuthurai LinkedIn :@B. Muthu</w:t>
+                                <w:t>Mayiladuthurai LinkedIn :</w:t>
                               </w:r>
+                              <w:hyperlink r:id="rId8" w:history="1">
+                                <w:r>
+                                  <w:rPr>
+                                    <w:rStyle w:val="Hyperlink"/>
+                                    <w:sz w:val="18"/>
+                                  </w:rPr>
+                                  <w:t>@B. Muthu</w:t>
+                                </w:r>
+                              </w:hyperlink>
                               <w:r>
                                 <w:rPr>
                                   <w:color w:val="474747"/>
@@ -281,7 +290,7 @@
                                 </w:rPr>
                                 <w:t xml:space="preserve">: </w:t>
                               </w:r>
-                              <w:hyperlink r:id="rId8">
+                              <w:hyperlink r:id="rId9">
                                 <w:r>
                                   <w:rPr>
                                     <w:color w:val="0462C1"/>
@@ -294,7 +303,7 @@
                               <w:r>
                                 <w:t xml:space="preserve"> / </w:t>
                               </w:r>
-                              <w:hyperlink r:id="rId9" w:history="1">
+                              <w:hyperlink r:id="rId10" w:history="1">
                                 <w:r>
                                   <w:rPr>
                                     <w:rStyle w:val="Hyperlink"/>
@@ -339,10 +348,10 @@
                   <o:lock v:ext="edit" aspectratio="t"/>
                 </v:shapetype>
                 <v:shape id="Image 2" o:spid="_x0000_s1027" type="#_x0000_t75" style="position:absolute;top:67;width:75438;height:12463;visibility:visible;mso-wrap-style:square" o:gfxdata="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">
-                  <v:imagedata r:id="rId10" o:title=""/>
+                  <v:imagedata r:id="rId11" o:title=""/>
                 </v:shape>
                 <v:shape id="Image 3" o:spid="_x0000_s1028" type="#_x0000_t75" style="position:absolute;left:59893;width:10210;height:12546;visibility:visible;mso-wrap-style:square" o:gfxdata="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">
-                  <v:imagedata r:id="rId11" o:title=""/>
+                  <v:imagedata r:id="rId12" o:title=""/>
                 </v:shape>
                 <v:shapetype id="_x0000_t202" coordsize="21600,21600" o:spt="202" path="m,l,21600r21600,l21600,xe">
                   <v:stroke joinstyle="miter"/>
@@ -432,7 +441,7 @@
                             <w:sz w:val="18"/>
                           </w:rPr>
                         </w:pPr>
-                        <w:hyperlink r:id="rId12">
+                        <w:hyperlink r:id="rId13">
                           <w:r>
                             <w:rPr>
                               <w:color w:val="474747"/>
@@ -504,8 +513,17 @@
                             <w:color w:val="474747"/>
                             <w:sz w:val="18"/>
                           </w:rPr>
-                          <w:t>Mayiladuthurai LinkedIn :@B. Muthu</w:t>
+                          <w:t>Mayiladuthurai LinkedIn :</w:t>
                         </w:r>
+                        <w:hyperlink r:id="rId14" w:history="1">
+                          <w:r>
+                            <w:rPr>
+                              <w:rStyle w:val="Hyperlink"/>
+                              <w:sz w:val="18"/>
+                            </w:rPr>
+                            <w:t>@B. Muthu</w:t>
+                          </w:r>
+                        </w:hyperlink>
                         <w:r>
                           <w:rPr>
                             <w:color w:val="474747"/>
@@ -537,7 +555,7 @@
                           </w:rPr>
                           <w:t xml:space="preserve">: </w:t>
                         </w:r>
-                        <w:hyperlink r:id="rId13">
+                        <w:hyperlink r:id="rId15">
                           <w:r>
                             <w:rPr>
                               <w:color w:val="0462C1"/>
@@ -550,7 +568,7 @@
                         <w:r>
                           <w:t xml:space="preserve"> / </w:t>
                         </w:r>
-                        <w:hyperlink r:id="rId14" w:history="1">
+                        <w:hyperlink r:id="rId16" w:history="1">
                           <w:r>
                             <w:rPr>
                               <w:rStyle w:val="Hyperlink"/>
@@ -650,7 +668,7 @@
           </mc:Choice>
           <mc:Fallback>
             <w:pict>
-              <v:shape w14:anchorId="6E667588" id="Graphic 5" o:spid="_x0000_s1026" style="position:absolute;margin-left:10.2pt;margin-top:8.35pt;width:577.8pt;height:.7pt;z-index:-15728128;visibility:visible;mso-wrap-style:square;mso-wrap-distance-left:0;mso-wrap-distance-top:0;mso-wrap-distance-right:0;mso-wrap-distance-bottom:0;mso-position-horizontal:absolute;mso-position-horizontal-relative:page;mso-position-vertical:absolute;mso-position-vertical-relative:text;v-text-anchor:top" coordsize="7338059,8890" o:gfxdata="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" path="m,l7338059,8382e" filled="f" strokecolor="#4471c4" strokeweight=".17636mm">
+              <v:shape w14:anchorId="60DDA658" id="Graphic 5" o:spid="_x0000_s1026" style="position:absolute;margin-left:10.2pt;margin-top:8.35pt;width:577.8pt;height:.7pt;z-index:-15728128;visibility:visible;mso-wrap-style:square;mso-wrap-distance-left:0;mso-wrap-distance-top:0;mso-wrap-distance-right:0;mso-wrap-distance-bottom:0;mso-position-horizontal:absolute;mso-position-horizontal-relative:page;mso-position-vertical:absolute;mso-position-vertical-relative:text;v-text-anchor:top" coordsize="7338059,8890" o:gfxdata="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" path="m,l7338059,8382e" filled="f" strokecolor="#4471c4" strokeweight=".17636mm">
                 <v:path arrowok="t"/>
                 <w10:wrap type="topAndBottom" anchorx="page"/>
               </v:shape>
@@ -2245,7 +2263,7 @@
                 <w:sz w:val="18"/>
               </w:rPr>
             </w:pPr>
-            <w:hyperlink r:id="rId15">
+            <w:hyperlink r:id="rId17">
               <w:r>
                 <w:rPr>
                   <w:b/>
@@ -2361,7 +2379,7 @@
                 <w:sz w:val="18"/>
               </w:rPr>
             </w:pPr>
-            <w:hyperlink r:id="rId16">
+            <w:hyperlink r:id="rId18">
               <w:r>
                 <w:rPr>
                   <w:b/>
@@ -4753,258 +4771,6 @@
                     <pic:cNvPicPr/>
                   </pic:nvPicPr>
                   <pic:blipFill>
-                    <a:blip r:embed="rId17" cstate="print"/>
-                    <a:stretch>
-                      <a:fillRect/>
-                    </a:stretch>
-                  </pic:blipFill>
-                  <pic:spPr>
-                    <a:xfrm>
-                      <a:off x="0" y="0"/>
-                      <a:ext cx="36195" cy="36702"/>
-                    </a:xfrm>
-                    <a:prstGeom prst="rect">
-                      <a:avLst/>
-                    </a:prstGeom>
-                  </pic:spPr>
-                </pic:pic>
-              </a:graphicData>
-            </a:graphic>
-          </wp:inline>
-        </w:drawing>
-      </w:r>
-      <w:r>
-        <w:rPr>
-          <w:spacing w:val="80"/>
-          <w:sz w:val="20"/>
-        </w:rPr>
-        <w:t xml:space="preserve"> </w:t>
-      </w:r>
-      <w:r>
-        <w:rPr>
-          <w:color w:val="474747"/>
-        </w:rPr>
-        <w:t>Digital Marketing</w:t>
-      </w:r>
-    </w:p>
-    <w:p>
-      <w:pPr>
-        <w:pStyle w:val="BodyText"/>
-        <w:spacing w:before="76" w:line="328" w:lineRule="auto"/>
-        <w:ind w:left="706" w:right="5920"/>
-      </w:pPr>
-      <w:r>
-        <w:rPr>
-          <w:noProof/>
-          <w:position w:val="7"/>
-        </w:rPr>
-        <w:drawing>
-          <wp:inline distT="0" distB="0" distL="0" distR="0" wp14:anchorId="7DBA13A8" wp14:editId="66910997">
-            <wp:extent cx="36195" cy="36575"/>
-            <wp:effectExtent l="0" t="0" r="0" b="0"/>
-            <wp:docPr id="7" name="Image 7"/>
-            <wp:cNvGraphicFramePr>
-              <a:graphicFrameLocks xmlns:a="http://schemas.openxmlformats.org/drawingml/2006/main"/>
-            </wp:cNvGraphicFramePr>
-            <a:graphic xmlns:a="http://schemas.openxmlformats.org/drawingml/2006/main">
-              <a:graphicData uri="http://schemas.openxmlformats.org/drawingml/2006/picture">
-                <pic:pic xmlns:pic="http://schemas.openxmlformats.org/drawingml/2006/picture">
-                  <pic:nvPicPr>
-                    <pic:cNvPr id="7" name="Image 7"/>
-                    <pic:cNvPicPr/>
-                  </pic:nvPicPr>
-                  <pic:blipFill>
-                    <a:blip r:embed="rId18" cstate="print"/>
-                    <a:stretch>
-                      <a:fillRect/>
-                    </a:stretch>
-                  </pic:blipFill>
-                  <pic:spPr>
-                    <a:xfrm>
-                      <a:off x="0" y="0"/>
-                      <a:ext cx="36195" cy="36575"/>
-                    </a:xfrm>
-                    <a:prstGeom prst="rect">
-                      <a:avLst/>
-                    </a:prstGeom>
-                  </pic:spPr>
-                </pic:pic>
-              </a:graphicData>
-            </a:graphic>
-          </wp:inline>
-        </w:drawing>
-      </w:r>
-      <w:r>
-        <w:rPr>
-          <w:spacing w:val="80"/>
-          <w:w w:val="150"/>
-          <w:sz w:val="20"/>
-        </w:rPr>
-        <w:t xml:space="preserve"> </w:t>
-      </w:r>
-      <w:r>
-        <w:rPr>
-          <w:color w:val="474747"/>
-        </w:rPr>
-        <w:t>Network</w:t>
-      </w:r>
-      <w:r>
-        <w:rPr>
-          <w:color w:val="474747"/>
-          <w:spacing w:val="-7"/>
-        </w:rPr>
-        <w:t xml:space="preserve"> </w:t>
-      </w:r>
-      <w:r>
-        <w:rPr>
-          <w:color w:val="474747"/>
-        </w:rPr>
-        <w:t>Marketing</w:t>
-      </w:r>
-      <w:r>
-        <w:rPr>
-          <w:color w:val="474747"/>
-          <w:spacing w:val="-5"/>
-        </w:rPr>
-        <w:t xml:space="preserve"> </w:t>
-      </w:r>
-      <w:r>
-        <w:rPr>
-          <w:color w:val="474747"/>
-        </w:rPr>
-        <w:t>-</w:t>
-      </w:r>
-      <w:r>
-        <w:rPr>
-          <w:color w:val="474747"/>
-          <w:spacing w:val="-6"/>
-        </w:rPr>
-        <w:t xml:space="preserve"> </w:t>
-      </w:r>
-      <w:r>
-        <w:rPr>
-          <w:color w:val="474747"/>
-        </w:rPr>
-        <w:t>2</w:t>
-      </w:r>
-      <w:r>
-        <w:rPr>
-          <w:color w:val="474747"/>
-          <w:spacing w:val="-12"/>
-        </w:rPr>
-        <w:t xml:space="preserve"> </w:t>
-      </w:r>
-      <w:r>
-        <w:rPr>
-          <w:color w:val="474747"/>
-        </w:rPr>
-        <w:t>Years</w:t>
-      </w:r>
-      <w:r>
-        <w:rPr>
-          <w:color w:val="474747"/>
-          <w:spacing w:val="-6"/>
-        </w:rPr>
-        <w:t xml:space="preserve"> </w:t>
-      </w:r>
-      <w:r>
-        <w:rPr>
-          <w:color w:val="474747"/>
-        </w:rPr>
-        <w:t>(Vestige</w:t>
-      </w:r>
-      <w:r>
-        <w:rPr>
-          <w:color w:val="474747"/>
-          <w:spacing w:val="-3"/>
-        </w:rPr>
-        <w:t xml:space="preserve"> </w:t>
-      </w:r>
-      <w:proofErr w:type="spellStart"/>
-      <w:proofErr w:type="gramStart"/>
-      <w:r>
-        <w:rPr>
-          <w:color w:val="474747"/>
-        </w:rPr>
-        <w:t>pvt.ltd</w:t>
-      </w:r>
-      <w:proofErr w:type="spellEnd"/>
-      <w:r>
-        <w:rPr>
-          <w:color w:val="474747"/>
-          <w:spacing w:val="-6"/>
-        </w:rPr>
-        <w:t xml:space="preserve"> </w:t>
-      </w:r>
-      <w:r>
-        <w:rPr>
-          <w:color w:val="474747"/>
-        </w:rPr>
-        <w:t>)</w:t>
-      </w:r>
-      <w:proofErr w:type="gramEnd"/>
-      <w:r>
-        <w:rPr>
-          <w:color w:val="474747"/>
-          <w:spacing w:val="-6"/>
-        </w:rPr>
-        <w:t xml:space="preserve"> </w:t>
-      </w:r>
-      <w:r>
-        <w:rPr>
-          <w:color w:val="474747"/>
-        </w:rPr>
-        <w:t>&amp;</w:t>
-      </w:r>
-      <w:r>
-        <w:rPr>
-          <w:color w:val="474747"/>
-          <w:spacing w:val="-10"/>
-        </w:rPr>
-        <w:t xml:space="preserve"> </w:t>
-      </w:r>
-      <w:r>
-        <w:rPr>
-          <w:color w:val="474747"/>
-        </w:rPr>
-        <w:t>(</w:t>
-      </w:r>
-      <w:proofErr w:type="spellStart"/>
-      <w:r>
-        <w:rPr>
-          <w:color w:val="474747"/>
-        </w:rPr>
-        <w:t>Accsys</w:t>
-      </w:r>
-      <w:proofErr w:type="spellEnd"/>
-      <w:r>
-        <w:rPr>
-          <w:color w:val="474747"/>
-        </w:rPr>
-        <w:t xml:space="preserve"> India.Com) </w:t>
-      </w:r>
-      <w:r>
-        <w:rPr>
-          <w:noProof/>
-          <w:color w:val="474747"/>
-          <w:position w:val="7"/>
-        </w:rPr>
-        <w:drawing>
-          <wp:inline distT="0" distB="0" distL="0" distR="0" wp14:anchorId="6529E5E8" wp14:editId="1365DF62">
-            <wp:extent cx="36195" cy="36702"/>
-            <wp:effectExtent l="0" t="0" r="0" b="0"/>
-            <wp:docPr id="8" name="Image 8"/>
-            <wp:cNvGraphicFramePr>
-              <a:graphicFrameLocks xmlns:a="http://schemas.openxmlformats.org/drawingml/2006/main"/>
-            </wp:cNvGraphicFramePr>
-            <a:graphic xmlns:a="http://schemas.openxmlformats.org/drawingml/2006/main">
-              <a:graphicData uri="http://schemas.openxmlformats.org/drawingml/2006/picture">
-                <pic:pic xmlns:pic="http://schemas.openxmlformats.org/drawingml/2006/picture">
-                  <pic:nvPicPr>
-                    <pic:cNvPr id="8" name="Image 8"/>
-                    <pic:cNvPicPr/>
-                  </pic:nvPicPr>
-                  <pic:blipFill>
                     <a:blip r:embed="rId19" cstate="print"/>
                     <a:stretch>
                       <a:fillRect/>
@@ -5027,34 +4793,34 @@
       </w:r>
       <w:r>
         <w:rPr>
-          <w:color w:val="474747"/>
           <w:spacing w:val="80"/>
-        </w:rPr>
-        <w:t xml:space="preserve"> </w:t>
-      </w:r>
-      <w:r>
-        <w:rPr>
-          <w:color w:val="474747"/>
-        </w:rPr>
-        <w:t>Drawing</w:t>
+          <w:sz w:val="20"/>
+        </w:rPr>
+        <w:t xml:space="preserve"> </w:t>
+      </w:r>
+      <w:r>
+        <w:rPr>
+          <w:color w:val="474747"/>
+        </w:rPr>
+        <w:t>Digital Marketing</w:t>
       </w:r>
     </w:p>
     <w:p>
       <w:pPr>
         <w:pStyle w:val="BodyText"/>
-        <w:spacing w:before="5"/>
-        <w:ind w:left="706"/>
+        <w:spacing w:before="76" w:line="328" w:lineRule="auto"/>
+        <w:ind w:left="706" w:right="5920"/>
       </w:pPr>
       <w:r>
         <w:rPr>
           <w:noProof/>
-          <w:position w:val="9"/>
+          <w:position w:val="7"/>
         </w:rPr>
         <w:drawing>
-          <wp:inline distT="0" distB="0" distL="0" distR="0" wp14:anchorId="46376DDF" wp14:editId="577ED17D">
-            <wp:extent cx="36195" cy="36702"/>
+          <wp:inline distT="0" distB="0" distL="0" distR="0" wp14:anchorId="7DBA13A8" wp14:editId="66910997">
+            <wp:extent cx="36195" cy="36575"/>
             <wp:effectExtent l="0" t="0" r="0" b="0"/>
-            <wp:docPr id="9" name="Image 9"/>
+            <wp:docPr id="7" name="Image 7"/>
             <wp:cNvGraphicFramePr>
               <a:graphicFrameLocks xmlns:a="http://schemas.openxmlformats.org/drawingml/2006/main"/>
             </wp:cNvGraphicFramePr>
@@ -5062,7 +4828,7 @@
               <a:graphicData uri="http://schemas.openxmlformats.org/drawingml/2006/picture">
                 <pic:pic xmlns:pic="http://schemas.openxmlformats.org/drawingml/2006/picture">
                   <pic:nvPicPr>
-                    <pic:cNvPr id="9" name="Image 9"/>
+                    <pic:cNvPr id="7" name="Image 7"/>
                     <pic:cNvPicPr/>
                   </pic:nvPicPr>
                   <pic:blipFill>
@@ -5074,7 +4840,7 @@
                   <pic:spPr>
                     <a:xfrm>
                       <a:off x="0" y="0"/>
-                      <a:ext cx="36195" cy="36702"/>
+                      <a:ext cx="36195" cy="36575"/>
                     </a:xfrm>
                     <a:prstGeom prst="rect">
                       <a:avLst/>
@@ -5089,6 +4855,7 @@
       <w:r>
         <w:rPr>
           <w:spacing w:val="80"/>
+          <w:w w:val="150"/>
           <w:sz w:val="20"/>
         </w:rPr>
         <w:t xml:space="preserve"> </w:t>
@@ -5097,39 +4864,154 @@
         <w:rPr>
           <w:color w:val="474747"/>
         </w:rPr>
-        <w:t xml:space="preserve">NSS-2 </w:t>
-      </w:r>
+        <w:t>Network</w:t>
+      </w:r>
+      <w:r>
+        <w:rPr>
+          <w:color w:val="474747"/>
+          <w:spacing w:val="-7"/>
+        </w:rPr>
+        <w:t xml:space="preserve"> </w:t>
+      </w:r>
+      <w:r>
+        <w:rPr>
+          <w:color w:val="474747"/>
+        </w:rPr>
+        <w:t>Marketing</w:t>
+      </w:r>
+      <w:r>
+        <w:rPr>
+          <w:color w:val="474747"/>
+          <w:spacing w:val="-5"/>
+        </w:rPr>
+        <w:t xml:space="preserve"> </w:t>
+      </w:r>
+      <w:r>
+        <w:rPr>
+          <w:color w:val="474747"/>
+        </w:rPr>
+        <w:t>-</w:t>
+      </w:r>
+      <w:r>
+        <w:rPr>
+          <w:color w:val="474747"/>
+          <w:spacing w:val="-6"/>
+        </w:rPr>
+        <w:t xml:space="preserve"> </w:t>
+      </w:r>
+      <w:r>
+        <w:rPr>
+          <w:color w:val="474747"/>
+        </w:rPr>
+        <w:t>2</w:t>
+      </w:r>
+      <w:r>
+        <w:rPr>
+          <w:color w:val="474747"/>
+          <w:spacing w:val="-12"/>
+        </w:rPr>
+        <w:t xml:space="preserve"> </w:t>
+      </w:r>
+      <w:r>
+        <w:rPr>
+          <w:color w:val="474747"/>
+        </w:rPr>
+        <w:t>Years</w:t>
+      </w:r>
+      <w:r>
+        <w:rPr>
+          <w:color w:val="474747"/>
+          <w:spacing w:val="-6"/>
+        </w:rPr>
+        <w:t xml:space="preserve"> </w:t>
+      </w:r>
+      <w:r>
+        <w:rPr>
+          <w:color w:val="474747"/>
+        </w:rPr>
+        <w:t>(Vestige</w:t>
+      </w:r>
+      <w:r>
+        <w:rPr>
+          <w:color w:val="474747"/>
+          <w:spacing w:val="-3"/>
+        </w:rPr>
+        <w:t xml:space="preserve"> </w:t>
+      </w:r>
+      <w:proofErr w:type="spellStart"/>
       <w:proofErr w:type="gramStart"/>
       <w:r>
         <w:rPr>
           <w:color w:val="474747"/>
         </w:rPr>
-        <w:t>years(</w:t>
+        <w:t>pvt.ltd</w:t>
+      </w:r>
+      <w:proofErr w:type="spellEnd"/>
+      <w:r>
+        <w:rPr>
+          <w:color w:val="474747"/>
+          <w:spacing w:val="-6"/>
+        </w:rPr>
+        <w:t xml:space="preserve"> </w:t>
+      </w:r>
+      <w:r>
+        <w:rPr>
+          <w:color w:val="474747"/>
+        </w:rPr>
+        <w:t>)</w:t>
       </w:r>
       <w:proofErr w:type="gramEnd"/>
       <w:r>
         <w:rPr>
           <w:color w:val="474747"/>
-        </w:rPr>
-        <w:t>2020-2021)</w:t>
-      </w:r>
-    </w:p>
-    <w:p>
-      <w:pPr>
-        <w:pStyle w:val="BodyText"/>
-        <w:spacing w:before="71"/>
-        <w:ind w:left="706"/>
-      </w:pPr>
+          <w:spacing w:val="-6"/>
+        </w:rPr>
+        <w:t xml:space="preserve"> </w:t>
+      </w:r>
+      <w:r>
+        <w:rPr>
+          <w:color w:val="474747"/>
+        </w:rPr>
+        <w:t>&amp;</w:t>
+      </w:r>
+      <w:r>
+        <w:rPr>
+          <w:color w:val="474747"/>
+          <w:spacing w:val="-10"/>
+        </w:rPr>
+        <w:t xml:space="preserve"> </w:t>
+      </w:r>
+      <w:r>
+        <w:rPr>
+          <w:color w:val="474747"/>
+        </w:rPr>
+        <w:t>(</w:t>
+      </w:r>
+      <w:proofErr w:type="spellStart"/>
+      <w:r>
+        <w:rPr>
+          <w:color w:val="474747"/>
+        </w:rPr>
+        <w:t>Accsys</w:t>
+      </w:r>
+      <w:proofErr w:type="spellEnd"/>
+      <w:r>
+        <w:rPr>
+          <w:color w:val="474747"/>
+        </w:rPr>
+        <w:t xml:space="preserve"> India.Com) </w:t>
+      </w:r>
       <w:r>
         <w:rPr>
           <w:noProof/>
-          <w:position w:val="9"/>
+          <w:color w:val="474747"/>
+          <w:position w:val="7"/>
         </w:rPr>
         <w:drawing>
-          <wp:inline distT="0" distB="0" distL="0" distR="0" wp14:anchorId="37377B35" wp14:editId="667E6F14">
+          <wp:inline distT="0" distB="0" distL="0" distR="0" wp14:anchorId="6529E5E8" wp14:editId="1365DF62">
             <wp:extent cx="36195" cy="36702"/>
             <wp:effectExtent l="0" t="0" r="0" b="0"/>
-            <wp:docPr id="10" name="Image 10"/>
+            <wp:docPr id="8" name="Image 8"/>
             <wp:cNvGraphicFramePr>
               <a:graphicFrameLocks xmlns:a="http://schemas.openxmlformats.org/drawingml/2006/main"/>
             </wp:cNvGraphicFramePr>
@@ -5137,7 +5019,7 @@
               <a:graphicData uri="http://schemas.openxmlformats.org/drawingml/2006/picture">
                 <pic:pic xmlns:pic="http://schemas.openxmlformats.org/drawingml/2006/picture">
                   <pic:nvPicPr>
-                    <pic:cNvPr id="10" name="Image 10"/>
+                    <pic:cNvPr id="8" name="Image 8"/>
                     <pic:cNvPicPr/>
                   </pic:nvPicPr>
                   <pic:blipFill>
@@ -5163,86 +5045,34 @@
       </w:r>
       <w:r>
         <w:rPr>
+          <w:color w:val="474747"/>
           <w:spacing w:val="80"/>
-          <w:w w:val="150"/>
-          <w:sz w:val="20"/>
-        </w:rPr>
-        <w:t xml:space="preserve"> </w:t>
-      </w:r>
-      <w:r>
-        <w:rPr>
-          <w:color w:val="474747"/>
-        </w:rPr>
-        <w:t xml:space="preserve">Sports -Athletics, Basketball, </w:t>
-      </w:r>
-      <w:proofErr w:type="gramStart"/>
-      <w:r>
-        <w:rPr>
-          <w:color w:val="474747"/>
-        </w:rPr>
-        <w:t>Hockey ,</w:t>
-      </w:r>
-      <w:proofErr w:type="gramEnd"/>
-      <w:r>
-        <w:rPr>
-          <w:color w:val="474747"/>
-        </w:rPr>
-        <w:t xml:space="preserve"> Volleyball.</w:t>
+        </w:rPr>
+        <w:t xml:space="preserve"> </w:t>
+      </w:r>
+      <w:r>
+        <w:rPr>
+          <w:color w:val="474747"/>
+        </w:rPr>
+        <w:t>Drawing</w:t>
       </w:r>
     </w:p>
     <w:p>
       <w:pPr>
         <w:pStyle w:val="BodyText"/>
+        <w:spacing w:before="5"/>
+        <w:ind w:left="706"/>
       </w:pPr>
-    </w:p>
-    <w:p>
-      <w:pPr>
-        <w:pStyle w:val="BodyText"/>
-        <w:spacing w:before="37"/>
-      </w:pPr>
-    </w:p>
-    <w:p>
-      <w:pPr>
-        <w:pStyle w:val="Heading1"/>
-      </w:pPr>
-      <w:r>
-        <w:rPr>
-          <w:color w:val="2E5395"/>
-          <w:spacing w:val="-2"/>
-        </w:rPr>
-        <w:t>ADDITIONAL</w:t>
-      </w:r>
-      <w:r>
-        <w:rPr>
-          <w:color w:val="2E5395"/>
-          <w:spacing w:val="1"/>
-        </w:rPr>
-        <w:t xml:space="preserve"> </w:t>
-      </w:r>
-      <w:r>
-        <w:rPr>
-          <w:color w:val="2E5395"/>
-          <w:spacing w:val="-2"/>
-        </w:rPr>
-        <w:t>DETAILS:</w:t>
-      </w:r>
-    </w:p>
-    <w:p>
-      <w:pPr>
-        <w:pStyle w:val="BodyText"/>
-        <w:spacing w:before="186"/>
-        <w:ind w:left="756"/>
-      </w:pPr>
       <w:r>
         <w:rPr>
           <w:noProof/>
-          <w:position w:val="8"/>
+          <w:position w:val="9"/>
         </w:rPr>
         <w:drawing>
-          <wp:inline distT="0" distB="0" distL="0" distR="0" wp14:anchorId="1B782F67" wp14:editId="6CBF53CA">
+          <wp:inline distT="0" distB="0" distL="0" distR="0" wp14:anchorId="46376DDF" wp14:editId="577ED17D">
             <wp:extent cx="36195" cy="36702"/>
             <wp:effectExtent l="0" t="0" r="0" b="0"/>
-            <wp:docPr id="11" name="Image 11"/>
+            <wp:docPr id="9" name="Image 9"/>
             <wp:cNvGraphicFramePr>
               <a:graphicFrameLocks xmlns:a="http://schemas.openxmlformats.org/drawingml/2006/main"/>
             </wp:cNvGraphicFramePr>
@@ -5250,7 +5080,7 @@
               <a:graphicData uri="http://schemas.openxmlformats.org/drawingml/2006/picture">
                 <pic:pic xmlns:pic="http://schemas.openxmlformats.org/drawingml/2006/picture">
                   <pic:nvPicPr>
-                    <pic:cNvPr id="11" name="Image 11"/>
+                    <pic:cNvPr id="9" name="Image 9"/>
                     <pic:cNvPicPr/>
                   </pic:nvPicPr>
                   <pic:blipFill>
@@ -5276,102 +5106,48 @@
       </w:r>
       <w:r>
         <w:rPr>
-          <w:spacing w:val="40"/>
+          <w:spacing w:val="80"/>
           <w:sz w:val="20"/>
         </w:rPr>
-        <w:t xml:space="preserve">  </w:t>
-      </w:r>
-      <w:r>
-        <w:rPr>
-          <w:color w:val="474747"/>
-        </w:rPr>
-        <w:t>I</w:t>
-      </w:r>
-      <w:r>
-        <w:rPr>
-          <w:color w:val="474747"/>
-          <w:spacing w:val="-1"/>
-        </w:rPr>
-        <w:t xml:space="preserve"> </w:t>
-      </w:r>
-      <w:r>
-        <w:rPr>
-          <w:color w:val="474747"/>
-        </w:rPr>
-        <w:t xml:space="preserve">Have </w:t>
+        <w:t xml:space="preserve"> </w:t>
+      </w:r>
+      <w:r>
+        <w:rPr>
+          <w:color w:val="474747"/>
+        </w:rPr>
+        <w:t xml:space="preserve">NSS-2 </w:t>
       </w:r>
       <w:proofErr w:type="gramStart"/>
       <w:r>
         <w:rPr>
           <w:color w:val="474747"/>
         </w:rPr>
-        <w:t>attend</w:t>
+        <w:t>years(</w:t>
       </w:r>
       <w:proofErr w:type="gramEnd"/>
       <w:r>
         <w:rPr>
           <w:color w:val="474747"/>
         </w:rPr>
-        <w:t xml:space="preserve"> 1 day</w:t>
-      </w:r>
-      <w:r>
-        <w:rPr>
-          <w:color w:val="474747"/>
-          <w:spacing w:val="-2"/>
-        </w:rPr>
-        <w:t xml:space="preserve"> </w:t>
-      </w:r>
-      <w:r>
-        <w:rPr>
-          <w:color w:val="474747"/>
-        </w:rPr>
-        <w:t xml:space="preserve">Data Science Workshop in </w:t>
-      </w:r>
-      <w:proofErr w:type="spellStart"/>
-      <w:r>
-        <w:rPr>
-          <w:color w:val="474747"/>
-        </w:rPr>
-        <w:t>Sugnua</w:t>
-      </w:r>
-      <w:proofErr w:type="spellEnd"/>
-      <w:r>
-        <w:rPr>
-          <w:color w:val="474747"/>
-        </w:rPr>
-        <w:t xml:space="preserve"> College </w:t>
-      </w:r>
-      <w:proofErr w:type="gramStart"/>
-      <w:r>
-        <w:rPr>
-          <w:color w:val="474747"/>
-        </w:rPr>
-        <w:t>Of</w:t>
-      </w:r>
-      <w:proofErr w:type="gramEnd"/>
-      <w:r>
-        <w:rPr>
-          <w:color w:val="474747"/>
-        </w:rPr>
-        <w:t xml:space="preserve"> Engineering, Coimbatore</w:t>
+        <w:t>2020-2021)</w:t>
       </w:r>
     </w:p>
     <w:p>
       <w:pPr>
         <w:pStyle w:val="BodyText"/>
-        <w:spacing w:before="72" w:line="328" w:lineRule="auto"/>
-        <w:ind w:left="756" w:right="1376"/>
+        <w:spacing w:before="71"/>
+        <w:ind w:left="706"/>
       </w:pPr>
       <w:r>
         <w:rPr>
           <w:noProof/>
-          <w:position w:val="8"/>
+          <w:position w:val="9"/>
         </w:rPr>
         <w:drawing>
-          <wp:inline distT="0" distB="0" distL="0" distR="0" wp14:anchorId="02FE5044" wp14:editId="7159F91F">
+          <wp:inline distT="0" distB="0" distL="0" distR="0" wp14:anchorId="37377B35" wp14:editId="667E6F14">
             <wp:extent cx="36195" cy="36702"/>
             <wp:effectExtent l="0" t="0" r="0" b="0"/>
-            <wp:docPr id="12" name="Image 12"/>
+            <wp:docPr id="10" name="Image 10"/>
             <wp:cNvGraphicFramePr>
               <a:graphicFrameLocks xmlns:a="http://schemas.openxmlformats.org/drawingml/2006/main"/>
             </wp:cNvGraphicFramePr>
@@ -5379,7 +5155,7 @@
               <a:graphicData uri="http://schemas.openxmlformats.org/drawingml/2006/picture">
                 <pic:pic xmlns:pic="http://schemas.openxmlformats.org/drawingml/2006/picture">
                   <pic:nvPicPr>
-                    <pic:cNvPr id="12" name="Image 12"/>
+                    <pic:cNvPr id="10" name="Image 10"/>
                     <pic:cNvPicPr/>
                   </pic:nvPicPr>
                   <pic:blipFill>
@@ -5415,6 +5191,248 @@
         <w:rPr>
           <w:color w:val="474747"/>
         </w:rPr>
+        <w:t xml:space="preserve">Sports -Athletics, Basketball, </w:t>
+      </w:r>
+      <w:proofErr w:type="gramStart"/>
+      <w:r>
+        <w:rPr>
+          <w:color w:val="474747"/>
+        </w:rPr>
+        <w:t>Hockey ,</w:t>
+      </w:r>
+      <w:proofErr w:type="gramEnd"/>
+      <w:r>
+        <w:rPr>
+          <w:color w:val="474747"/>
+        </w:rPr>
+        <w:t xml:space="preserve"> Volleyball.</w:t>
+      </w:r>
+    </w:p>
+    <w:p>
+      <w:pPr>
+        <w:pStyle w:val="BodyText"/>
+      </w:pPr>
+    </w:p>
+    <w:p>
+      <w:pPr>
+        <w:pStyle w:val="BodyText"/>
+        <w:spacing w:before="37"/>
+      </w:pPr>
+    </w:p>
+    <w:p>
+      <w:pPr>
+        <w:pStyle w:val="Heading1"/>
+      </w:pPr>
+      <w:r>
+        <w:rPr>
+          <w:color w:val="2E5395"/>
+          <w:spacing w:val="-2"/>
+        </w:rPr>
+        <w:t>ADDITIONAL</w:t>
+      </w:r>
+      <w:r>
+        <w:rPr>
+          <w:color w:val="2E5395"/>
+          <w:spacing w:val="1"/>
+        </w:rPr>
+        <w:t xml:space="preserve"> </w:t>
+      </w:r>
+      <w:r>
+        <w:rPr>
+          <w:color w:val="2E5395"/>
+          <w:spacing w:val="-2"/>
+        </w:rPr>
+        <w:t>DETAILS:</w:t>
+      </w:r>
+    </w:p>
+    <w:p>
+      <w:pPr>
+        <w:pStyle w:val="BodyText"/>
+        <w:spacing w:before="186"/>
+        <w:ind w:left="756"/>
+      </w:pPr>
+      <w:r>
+        <w:rPr>
+          <w:noProof/>
+          <w:position w:val="8"/>
+        </w:rPr>
+        <w:drawing>
+          <wp:inline distT="0" distB="0" distL="0" distR="0" wp14:anchorId="1B782F67" wp14:editId="6CBF53CA">
+            <wp:extent cx="36195" cy="36702"/>
+            <wp:effectExtent l="0" t="0" r="0" b="0"/>
+            <wp:docPr id="11" name="Image 11"/>
+            <wp:cNvGraphicFramePr>
+              <a:graphicFrameLocks xmlns:a="http://schemas.openxmlformats.org/drawingml/2006/main"/>
+            </wp:cNvGraphicFramePr>
+            <a:graphic xmlns:a="http://schemas.openxmlformats.org/drawingml/2006/main">
+              <a:graphicData uri="http://schemas.openxmlformats.org/drawingml/2006/picture">
+                <pic:pic xmlns:pic="http://schemas.openxmlformats.org/drawingml/2006/picture">
+                  <pic:nvPicPr>
+                    <pic:cNvPr id="11" name="Image 11"/>
+                    <pic:cNvPicPr/>
+                  </pic:nvPicPr>
+                  <pic:blipFill>
+                    <a:blip r:embed="rId24" cstate="print"/>
+                    <a:stretch>
+                      <a:fillRect/>
+                    </a:stretch>
+                  </pic:blipFill>
+                  <pic:spPr>
+                    <a:xfrm>
+                      <a:off x="0" y="0"/>
+                      <a:ext cx="36195" cy="36702"/>
+                    </a:xfrm>
+                    <a:prstGeom prst="rect">
+                      <a:avLst/>
+                    </a:prstGeom>
+                  </pic:spPr>
+                </pic:pic>
+              </a:graphicData>
+            </a:graphic>
+          </wp:inline>
+        </w:drawing>
+      </w:r>
+      <w:r>
+        <w:rPr>
+          <w:spacing w:val="40"/>
+          <w:sz w:val="20"/>
+        </w:rPr>
+        <w:t xml:space="preserve">  </w:t>
+      </w:r>
+      <w:r>
+        <w:rPr>
+          <w:color w:val="474747"/>
+        </w:rPr>
+        <w:t>I</w:t>
+      </w:r>
+      <w:r>
+        <w:rPr>
+          <w:color w:val="474747"/>
+          <w:spacing w:val="-1"/>
+        </w:rPr>
+        <w:t xml:space="preserve"> </w:t>
+      </w:r>
+      <w:r>
+        <w:rPr>
+          <w:color w:val="474747"/>
+        </w:rPr>
+        <w:t xml:space="preserve">Have </w:t>
+      </w:r>
+      <w:proofErr w:type="gramStart"/>
+      <w:r>
+        <w:rPr>
+          <w:color w:val="474747"/>
+        </w:rPr>
+        <w:t>attend</w:t>
+      </w:r>
+      <w:proofErr w:type="gramEnd"/>
+      <w:r>
+        <w:rPr>
+          <w:color w:val="474747"/>
+        </w:rPr>
+        <w:t xml:space="preserve"> 1 day</w:t>
+      </w:r>
+      <w:r>
+        <w:rPr>
+          <w:color w:val="474747"/>
+          <w:spacing w:val="-2"/>
+        </w:rPr>
+        <w:t xml:space="preserve"> </w:t>
+      </w:r>
+      <w:r>
+        <w:rPr>
+          <w:color w:val="474747"/>
+        </w:rPr>
+        <w:t xml:space="preserve">Data Science Workshop in </w:t>
+      </w:r>
+      <w:proofErr w:type="spellStart"/>
+      <w:r>
+        <w:rPr>
+          <w:color w:val="474747"/>
+        </w:rPr>
+        <w:t>Sugnua</w:t>
+      </w:r>
+      <w:proofErr w:type="spellEnd"/>
+      <w:r>
+        <w:rPr>
+          <w:color w:val="474747"/>
+        </w:rPr>
+        <w:t xml:space="preserve"> College </w:t>
+      </w:r>
+      <w:proofErr w:type="gramStart"/>
+      <w:r>
+        <w:rPr>
+          <w:color w:val="474747"/>
+        </w:rPr>
+        <w:t>Of</w:t>
+      </w:r>
+      <w:proofErr w:type="gramEnd"/>
+      <w:r>
+        <w:rPr>
+          <w:color w:val="474747"/>
+        </w:rPr>
+        <w:t xml:space="preserve"> Engineering, Coimbatore</w:t>
+      </w:r>
+    </w:p>
+    <w:p>
+      <w:pPr>
+        <w:pStyle w:val="BodyText"/>
+        <w:spacing w:before="72" w:line="328" w:lineRule="auto"/>
+        <w:ind w:left="756" w:right="1376"/>
+      </w:pPr>
+      <w:r>
+        <w:rPr>
+          <w:noProof/>
+          <w:position w:val="8"/>
+        </w:rPr>
+        <w:drawing>
+          <wp:inline distT="0" distB="0" distL="0" distR="0" wp14:anchorId="02FE5044" wp14:editId="7159F91F">
+            <wp:extent cx="36195" cy="36702"/>
+            <wp:effectExtent l="0" t="0" r="0" b="0"/>
+            <wp:docPr id="12" name="Image 12"/>
+            <wp:cNvGraphicFramePr>
+              <a:graphicFrameLocks xmlns:a="http://schemas.openxmlformats.org/drawingml/2006/main"/>
+            </wp:cNvGraphicFramePr>
+            <a:graphic xmlns:a="http://schemas.openxmlformats.org/drawingml/2006/main">
+              <a:graphicData uri="http://schemas.openxmlformats.org/drawingml/2006/picture">
+                <pic:pic xmlns:pic="http://schemas.openxmlformats.org/drawingml/2006/picture">
+                  <pic:nvPicPr>
+                    <pic:cNvPr id="12" name="Image 12"/>
+                    <pic:cNvPicPr/>
+                  </pic:nvPicPr>
+                  <pic:blipFill>
+                    <a:blip r:embed="rId25" cstate="print"/>
+                    <a:stretch>
+                      <a:fillRect/>
+                    </a:stretch>
+                  </pic:blipFill>
+                  <pic:spPr>
+                    <a:xfrm>
+                      <a:off x="0" y="0"/>
+                      <a:ext cx="36195" cy="36702"/>
+                    </a:xfrm>
+                    <a:prstGeom prst="rect">
+                      <a:avLst/>
+                    </a:prstGeom>
+                  </pic:spPr>
+                </pic:pic>
+              </a:graphicData>
+            </a:graphic>
+          </wp:inline>
+        </w:drawing>
+      </w:r>
+      <w:r>
+        <w:rPr>
+          <w:spacing w:val="80"/>
+          <w:w w:val="150"/>
+          <w:sz w:val="20"/>
+        </w:rPr>
+        <w:t xml:space="preserve"> </w:t>
+      </w:r>
+      <w:r>
+        <w:rPr>
+          <w:color w:val="474747"/>
+        </w:rPr>
         <w:t>I</w:t>
       </w:r>
       <w:r>
@@ -5660,7 +5678,7 @@
                     <pic:cNvPicPr/>
                   </pic:nvPicPr>
                   <pic:blipFill>
-                    <a:blip r:embed="rId24" cstate="print"/>
+                    <a:blip r:embed="rId26" cstate="print"/>
                     <a:stretch>
                       <a:fillRect/>
                     </a:stretch>

</xml_diff>